<commit_message>
Update ICR Prepare with simplified search, updated Word templates, and exclude webcam & speaker from duplicate checks
</commit_message>
<xml_diff>
--- a/Final_ICR_Format_ICT-108_&_Smart_-_664/ICR_Format_ICT_101_5_INCS.docx
+++ b/Final_ICR_Format_ICT-108_&_Smart_-_664/ICR_Format_ICT_101_5_INCS.docx
@@ -546,6 +546,13 @@
                 <w:sz w:val="18"/>
               </w:rPr>
             </w:pPr>
+            <w:r>
+              <w:rPr>
+                <w:rFonts w:ascii="Bookman Old Style" w:hAnsi="Bookman Old Style"/>
+                <w:sz w:val="18"/>
+              </w:rPr>
+              <w:t>01</w:t>
+            </w:r>
           </w:p>
         </w:tc>
         <w:tc>
@@ -561,6 +568,13 @@
                 <w:sz w:val="18"/>
               </w:rPr>
             </w:pPr>
+            <w:r>
+              <w:rPr>
+                <w:rFonts w:ascii="Bookman Old Style" w:hAnsi="Bookman Old Style"/>
+                <w:sz w:val="18"/>
+              </w:rPr>
+              <w:t>01</w:t>
+            </w:r>
           </w:p>
         </w:tc>
         <w:tc>
@@ -576,6 +590,13 @@
                 <w:sz w:val="18"/>
               </w:rPr>
             </w:pPr>
+            <w:r>
+              <w:rPr>
+                <w:rFonts w:ascii="Bookman Old Style" w:hAnsi="Bookman Old Style"/>
+                <w:sz w:val="18"/>
+              </w:rPr>
+              <w:t>Yes</w:t>
+            </w:r>
           </w:p>
         </w:tc>
         <w:tc>
@@ -591,6 +612,13 @@
                 <w:sz w:val="18"/>
               </w:rPr>
             </w:pPr>
+            <w:r>
+              <w:rPr>
+                <w:rFonts w:ascii="Bookman Old Style" w:hAnsi="Bookman Old Style"/>
+                <w:sz w:val="18"/>
+              </w:rPr>
+              <w:t>Yes</w:t>
+            </w:r>
           </w:p>
         </w:tc>
       </w:tr>
@@ -686,6 +714,13 @@
                 <w:sz w:val="18"/>
               </w:rPr>
             </w:pPr>
+            <w:r>
+              <w:rPr>
+                <w:rFonts w:ascii="Bookman Old Style" w:hAnsi="Bookman Old Style"/>
+                <w:sz w:val="18"/>
+              </w:rPr>
+              <w:t>01</w:t>
+            </w:r>
           </w:p>
         </w:tc>
         <w:tc>
@@ -701,6 +736,13 @@
                 <w:sz w:val="18"/>
               </w:rPr>
             </w:pPr>
+            <w:r>
+              <w:rPr>
+                <w:rFonts w:ascii="Bookman Old Style" w:hAnsi="Bookman Old Style"/>
+                <w:sz w:val="18"/>
+              </w:rPr>
+              <w:t>01</w:t>
+            </w:r>
           </w:p>
         </w:tc>
         <w:tc>
@@ -716,6 +758,13 @@
                 <w:sz w:val="18"/>
               </w:rPr>
             </w:pPr>
+            <w:r>
+              <w:rPr>
+                <w:rFonts w:ascii="Bookman Old Style" w:hAnsi="Bookman Old Style"/>
+                <w:sz w:val="18"/>
+              </w:rPr>
+              <w:t>Yes</w:t>
+            </w:r>
           </w:p>
         </w:tc>
         <w:tc>
@@ -731,6 +780,13 @@
                 <w:sz w:val="18"/>
               </w:rPr>
             </w:pPr>
+            <w:r>
+              <w:rPr>
+                <w:rFonts w:ascii="Bookman Old Style" w:hAnsi="Bookman Old Style"/>
+                <w:sz w:val="18"/>
+              </w:rPr>
+              <w:t>Yes</w:t>
+            </w:r>
           </w:p>
         </w:tc>
       </w:tr>
@@ -826,6 +882,13 @@
                 <w:sz w:val="18"/>
               </w:rPr>
             </w:pPr>
+            <w:r>
+              <w:rPr>
+                <w:rFonts w:ascii="Bookman Old Style" w:hAnsi="Bookman Old Style"/>
+                <w:sz w:val="18"/>
+              </w:rPr>
+              <w:t>01</w:t>
+            </w:r>
           </w:p>
         </w:tc>
         <w:tc>
@@ -841,6 +904,13 @@
                 <w:sz w:val="18"/>
               </w:rPr>
             </w:pPr>
+            <w:r>
+              <w:rPr>
+                <w:rFonts w:ascii="Bookman Old Style" w:hAnsi="Bookman Old Style"/>
+                <w:sz w:val="18"/>
+              </w:rPr>
+              <w:t>01</w:t>
+            </w:r>
           </w:p>
         </w:tc>
         <w:tc>
@@ -856,6 +926,13 @@
                 <w:sz w:val="18"/>
               </w:rPr>
             </w:pPr>
+            <w:r>
+              <w:rPr>
+                <w:rFonts w:ascii="Bookman Old Style" w:hAnsi="Bookman Old Style"/>
+                <w:sz w:val="18"/>
+              </w:rPr>
+              <w:t>Yes</w:t>
+            </w:r>
           </w:p>
         </w:tc>
         <w:tc>
@@ -871,6 +948,13 @@
                 <w:sz w:val="18"/>
               </w:rPr>
             </w:pPr>
+            <w:r>
+              <w:rPr>
+                <w:rFonts w:ascii="Bookman Old Style" w:hAnsi="Bookman Old Style"/>
+                <w:sz w:val="18"/>
+              </w:rPr>
+              <w:t>Yes</w:t>
+            </w:r>
           </w:p>
         </w:tc>
       </w:tr>
@@ -966,6 +1050,13 @@
                 <w:sz w:val="18"/>
               </w:rPr>
             </w:pPr>
+            <w:r>
+              <w:rPr>
+                <w:rFonts w:ascii="Bookman Old Style" w:hAnsi="Bookman Old Style"/>
+                <w:sz w:val="18"/>
+              </w:rPr>
+              <w:t>01</w:t>
+            </w:r>
           </w:p>
         </w:tc>
         <w:tc>
@@ -981,6 +1072,13 @@
                 <w:sz w:val="18"/>
               </w:rPr>
             </w:pPr>
+            <w:r>
+              <w:rPr>
+                <w:rFonts w:ascii="Bookman Old Style" w:hAnsi="Bookman Old Style"/>
+                <w:sz w:val="18"/>
+              </w:rPr>
+              <w:t>01</w:t>
+            </w:r>
           </w:p>
         </w:tc>
         <w:tc>
@@ -996,6 +1094,13 @@
                 <w:sz w:val="18"/>
               </w:rPr>
             </w:pPr>
+            <w:r>
+              <w:rPr>
+                <w:rFonts w:ascii="Bookman Old Style" w:hAnsi="Bookman Old Style"/>
+                <w:sz w:val="18"/>
+              </w:rPr>
+              <w:t>Yes</w:t>
+            </w:r>
           </w:p>
         </w:tc>
         <w:tc>
@@ -1011,6 +1116,13 @@
                 <w:sz w:val="18"/>
               </w:rPr>
             </w:pPr>
+            <w:r>
+              <w:rPr>
+                <w:rFonts w:ascii="Bookman Old Style" w:hAnsi="Bookman Old Style"/>
+                <w:sz w:val="18"/>
+              </w:rPr>
+              <w:t>Yes</w:t>
+            </w:r>
           </w:p>
         </w:tc>
       </w:tr>
@@ -1106,6 +1218,13 @@
                 <w:sz w:val="18"/>
               </w:rPr>
             </w:pPr>
+            <w:r>
+              <w:rPr>
+                <w:rFonts w:ascii="Bookman Old Style" w:hAnsi="Bookman Old Style"/>
+                <w:sz w:val="18"/>
+              </w:rPr>
+              <w:t>01</w:t>
+            </w:r>
           </w:p>
         </w:tc>
         <w:tc>
@@ -1121,6 +1240,13 @@
                 <w:sz w:val="18"/>
               </w:rPr>
             </w:pPr>
+            <w:r>
+              <w:rPr>
+                <w:rFonts w:ascii="Bookman Old Style" w:hAnsi="Bookman Old Style"/>
+                <w:sz w:val="18"/>
+              </w:rPr>
+              <w:t>01</w:t>
+            </w:r>
           </w:p>
         </w:tc>
         <w:tc>
@@ -1136,6 +1262,13 @@
                 <w:sz w:val="18"/>
               </w:rPr>
             </w:pPr>
+            <w:r>
+              <w:rPr>
+                <w:rFonts w:ascii="Bookman Old Style" w:hAnsi="Bookman Old Style"/>
+                <w:sz w:val="18"/>
+              </w:rPr>
+              <w:t>Yes</w:t>
+            </w:r>
           </w:p>
         </w:tc>
         <w:tc>
@@ -1151,6 +1284,13 @@
                 <w:sz w:val="18"/>
               </w:rPr>
             </w:pPr>
+            <w:r>
+              <w:rPr>
+                <w:rFonts w:ascii="Bookman Old Style" w:hAnsi="Bookman Old Style"/>
+                <w:sz w:val="18"/>
+              </w:rPr>
+              <w:t>Yes</w:t>
+            </w:r>
           </w:p>
         </w:tc>
       </w:tr>
@@ -1271,6 +1411,13 @@
                 <w:sz w:val="18"/>
               </w:rPr>
             </w:pPr>
+            <w:r>
+              <w:rPr>
+                <w:rFonts w:ascii="Bookman Old Style" w:hAnsi="Bookman Old Style"/>
+                <w:sz w:val="18"/>
+              </w:rPr>
+              <w:t>01</w:t>
+            </w:r>
           </w:p>
         </w:tc>
         <w:tc>
@@ -1287,6 +1434,13 @@
                 <w:sz w:val="18"/>
               </w:rPr>
             </w:pPr>
+            <w:r>
+              <w:rPr>
+                <w:rFonts w:ascii="Bookman Old Style" w:hAnsi="Bookman Old Style"/>
+                <w:sz w:val="18"/>
+              </w:rPr>
+              <w:t>01</w:t>
+            </w:r>
           </w:p>
         </w:tc>
         <w:tc>
@@ -1303,6 +1457,13 @@
                 <w:sz w:val="18"/>
               </w:rPr>
             </w:pPr>
+            <w:r>
+              <w:rPr>
+                <w:rFonts w:ascii="Bookman Old Style" w:hAnsi="Bookman Old Style"/>
+                <w:sz w:val="18"/>
+              </w:rPr>
+              <w:t>Yes</w:t>
+            </w:r>
           </w:p>
         </w:tc>
         <w:tc>
@@ -1319,6 +1480,13 @@
                 <w:sz w:val="18"/>
               </w:rPr>
             </w:pPr>
+            <w:r>
+              <w:rPr>
+                <w:rFonts w:ascii="Bookman Old Style" w:hAnsi="Bookman Old Style"/>
+                <w:sz w:val="18"/>
+              </w:rPr>
+              <w:t>Yes</w:t>
+            </w:r>
           </w:p>
         </w:tc>
       </w:tr>
@@ -1492,21 +1660,7 @@
                 <w:rFonts w:ascii="Bookman Old Style" w:hAnsi="Bookman Old Style"/>
                 <w:sz w:val="18"/>
               </w:rPr>
-              <w:t xml:space="preserve">  </w:t>
-            </w:r>
-            <w:r>
-              <w:rPr>
-                <w:rFonts w:ascii="Bookman Old Style" w:hAnsi="Bookman Old Style"/>
-                <w:sz w:val="18"/>
-              </w:rPr>
-              <w:t>2</w:t>
-            </w:r>
-            <w:r>
-              <w:rPr>
-                <w:rFonts w:ascii="Bookman Old Style" w:hAnsi="Bookman Old Style"/>
-                <w:sz w:val="18"/>
-              </w:rPr>
-              <w:t>.</w:t>
+              <w:t xml:space="preserve">  2.</w:t>
             </w:r>
           </w:p>
         </w:tc>
@@ -1567,23 +1721,7 @@
                 <w:sz w:val="18"/>
                 <w:szCs w:val="18"/>
               </w:rPr>
-              <w:t xml:space="preserve">Make - Brother     Model – </w:t>
-            </w:r>
-            <w:r>
-              <w:rPr>
-                <w:rFonts w:ascii="Book Antiqua" w:hAnsi="Book Antiqua"/>
-                <w:sz w:val="18"/>
-                <w:szCs w:val="18"/>
-              </w:rPr>
-              <w:t>DCP-B7640DW</w:t>
-            </w:r>
-            <w:r>
-              <w:rPr>
-                <w:rFonts w:ascii="Book Antiqua" w:hAnsi="Book Antiqua"/>
-                <w:sz w:val="18"/>
-                <w:szCs w:val="18"/>
-              </w:rPr>
-              <w:t>B</w:t>
+              <w:t>Make - Brother     Model – DCP-B7640DWB</w:t>
             </w:r>
           </w:p>
         </w:tc>
@@ -1607,6 +1745,13 @@
                 <w:szCs w:val="18"/>
               </w:rPr>
             </w:pPr>
+            <w:r>
+              <w:rPr>
+                <w:rFonts w:ascii="Bookman Old Style" w:hAnsi="Bookman Old Style"/>
+                <w:sz w:val="18"/>
+              </w:rPr>
+              <w:t>01</w:t>
+            </w:r>
           </w:p>
         </w:tc>
         <w:tc>
@@ -1630,6 +1775,13 @@
                 <w:lang w:bidi="ar-SA"/>
               </w:rPr>
             </w:pPr>
+            <w:r>
+              <w:rPr>
+                <w:rFonts w:ascii="Bookman Old Style" w:hAnsi="Bookman Old Style"/>
+                <w:sz w:val="18"/>
+              </w:rPr>
+              <w:t>01</w:t>
+            </w:r>
           </w:p>
         </w:tc>
         <w:tc>
@@ -1653,6 +1805,13 @@
                 <w:lang w:bidi="ar-SA"/>
               </w:rPr>
             </w:pPr>
+            <w:r>
+              <w:rPr>
+                <w:rFonts w:ascii="Bookman Old Style" w:hAnsi="Bookman Old Style"/>
+                <w:sz w:val="18"/>
+              </w:rPr>
+              <w:t>Yes</w:t>
+            </w:r>
           </w:p>
         </w:tc>
         <w:tc>
@@ -1676,6 +1835,13 @@
                 <w:lang w:bidi="ar-SA"/>
               </w:rPr>
             </w:pPr>
+            <w:r>
+              <w:rPr>
+                <w:rFonts w:ascii="Bookman Old Style" w:hAnsi="Bookman Old Style"/>
+                <w:sz w:val="18"/>
+              </w:rPr>
+              <w:t>Yes</w:t>
+            </w:r>
           </w:p>
         </w:tc>
       </w:tr>
@@ -1884,14 +2050,7 @@
                 <w:rFonts w:ascii="Bookman Old Style" w:hAnsi="Bookman Old Style"/>
                 <w:sz w:val="18"/>
               </w:rPr>
-              <w:t>3</w:t>
-            </w:r>
-            <w:r>
-              <w:rPr>
-                <w:rFonts w:ascii="Bookman Old Style" w:hAnsi="Bookman Old Style"/>
-                <w:sz w:val="18"/>
-              </w:rPr>
-              <w:t>.</w:t>
+              <w:t>3.</w:t>
             </w:r>
           </w:p>
         </w:tc>
@@ -2058,6 +2217,20 @@
                 <w:szCs w:val="18"/>
               </w:rPr>
             </w:pPr>
+            <w:r>
+              <w:rPr>
+                <w:rFonts w:ascii="Bookman Old Style" w:hAnsi="Bookman Old Style"/>
+                <w:sz w:val="18"/>
+              </w:rPr>
+              <w:t>0</w:t>
+            </w:r>
+            <w:r>
+              <w:rPr>
+                <w:rFonts w:ascii="Bookman Old Style" w:hAnsi="Bookman Old Style"/>
+                <w:sz w:val="18"/>
+              </w:rPr>
+              <w:t>5</w:t>
+            </w:r>
           </w:p>
         </w:tc>
         <w:tc>
@@ -2080,6 +2253,20 @@
                 <w:lang w:bidi="ar-SA"/>
               </w:rPr>
             </w:pPr>
+            <w:r>
+              <w:rPr>
+                <w:rFonts w:ascii="Bookman Old Style" w:hAnsi="Bookman Old Style"/>
+                <w:sz w:val="18"/>
+              </w:rPr>
+              <w:t>0</w:t>
+            </w:r>
+            <w:r>
+              <w:rPr>
+                <w:rFonts w:ascii="Bookman Old Style" w:hAnsi="Bookman Old Style"/>
+                <w:sz w:val="18"/>
+              </w:rPr>
+              <w:t>5</w:t>
+            </w:r>
           </w:p>
         </w:tc>
         <w:tc>
@@ -2102,6 +2289,13 @@
                 <w:lang w:bidi="ar-SA"/>
               </w:rPr>
             </w:pPr>
+            <w:r>
+              <w:rPr>
+                <w:rFonts w:ascii="Bookman Old Style" w:hAnsi="Bookman Old Style"/>
+                <w:sz w:val="18"/>
+              </w:rPr>
+              <w:t>Yes</w:t>
+            </w:r>
           </w:p>
         </w:tc>
         <w:tc>
@@ -2124,6 +2318,13 @@
                 <w:lang w:bidi="ar-SA"/>
               </w:rPr>
             </w:pPr>
+            <w:r>
+              <w:rPr>
+                <w:rFonts w:ascii="Bookman Old Style" w:hAnsi="Bookman Old Style"/>
+                <w:sz w:val="18"/>
+              </w:rPr>
+              <w:t>Yes</w:t>
+            </w:r>
           </w:p>
         </w:tc>
       </w:tr>
@@ -2152,14 +2353,7 @@
                 <w:rFonts w:ascii="Bookman Old Style" w:hAnsi="Bookman Old Style"/>
                 <w:sz w:val="18"/>
               </w:rPr>
-              <w:t>4</w:t>
-            </w:r>
-            <w:r>
-              <w:rPr>
-                <w:rFonts w:ascii="Bookman Old Style" w:hAnsi="Bookman Old Style"/>
-                <w:sz w:val="18"/>
-              </w:rPr>
-              <w:t>.</w:t>
+              <w:t>4.</w:t>
             </w:r>
           </w:p>
         </w:tc>
@@ -2251,6 +2445,15 @@
                 <w:szCs w:val="18"/>
               </w:rPr>
             </w:pPr>
+            <w:r>
+              <w:rPr>
+                <w:rFonts w:ascii="Book Antiqua" w:hAnsi="Book Antiqua"/>
+                <w:color w:val="000000" w:themeColor="text1"/>
+                <w:sz w:val="18"/>
+                <w:szCs w:val="18"/>
+              </w:rPr>
+              <w:t>09</w:t>
+            </w:r>
           </w:p>
         </w:tc>
         <w:tc>
@@ -2276,6 +2479,16 @@
                 <w:lang w:bidi="ar-SA"/>
               </w:rPr>
             </w:pPr>
+            <w:r>
+              <w:rPr>
+                <w:rFonts w:ascii="Book Antiqua" w:hAnsi="Book Antiqua"/>
+                <w:color w:val="000000" w:themeColor="text1"/>
+                <w:sz w:val="18"/>
+                <w:szCs w:val="18"/>
+                <w:lang w:bidi="ar-SA"/>
+              </w:rPr>
+              <w:t>09</w:t>
+            </w:r>
           </w:p>
         </w:tc>
         <w:tc>
@@ -2301,6 +2514,16 @@
                 <w:lang w:bidi="ar-SA"/>
               </w:rPr>
             </w:pPr>
+            <w:r>
+              <w:rPr>
+                <w:rFonts w:ascii="Book Antiqua" w:hAnsi="Book Antiqua"/>
+                <w:color w:val="000000" w:themeColor="text1"/>
+                <w:sz w:val="18"/>
+                <w:szCs w:val="18"/>
+                <w:lang w:bidi="ar-SA"/>
+              </w:rPr>
+              <w:t>Yes</w:t>
+            </w:r>
           </w:p>
         </w:tc>
         <w:tc>
@@ -2326,6 +2549,16 @@
                 <w:lang w:bidi="ar-SA"/>
               </w:rPr>
             </w:pPr>
+            <w:r>
+              <w:rPr>
+                <w:rFonts w:ascii="Book Antiqua" w:hAnsi="Book Antiqua"/>
+                <w:color w:val="000000" w:themeColor="text1"/>
+                <w:sz w:val="18"/>
+                <w:szCs w:val="18"/>
+                <w:lang w:bidi="ar-SA"/>
+              </w:rPr>
+              <w:t>Yes</w:t>
+            </w:r>
           </w:p>
         </w:tc>
       </w:tr>
@@ -2352,14 +2585,7 @@
                 <w:rFonts w:ascii="Bookman Old Style" w:hAnsi="Bookman Old Style"/>
                 <w:sz w:val="18"/>
               </w:rPr>
-              <w:t>5</w:t>
-            </w:r>
-            <w:r>
-              <w:rPr>
-                <w:rFonts w:ascii="Bookman Old Style" w:hAnsi="Bookman Old Style"/>
-                <w:sz w:val="18"/>
-              </w:rPr>
-              <w:t>..</w:t>
+              <w:t>5..</w:t>
             </w:r>
           </w:p>
         </w:tc>
@@ -2420,31 +2646,7 @@
                 <w:sz w:val="18"/>
                 <w:szCs w:val="18"/>
               </w:rPr>
-              <w:t>Make -</w:t>
-            </w:r>
-            <w:r>
-              <w:rPr>
-                <w:rFonts w:ascii="Book Antiqua" w:hAnsi="Book Antiqua"/>
-                <w:sz w:val="18"/>
-                <w:szCs w:val="18"/>
-              </w:rPr>
-              <w:t xml:space="preserve"> Numeric</w:t>
-            </w:r>
-            <w:r>
-              <w:rPr>
-                <w:rFonts w:ascii="Book Antiqua" w:hAnsi="Book Antiqua"/>
-                <w:sz w:val="18"/>
-                <w:szCs w:val="18"/>
-              </w:rPr>
-              <w:t xml:space="preserve">       Model – </w:t>
-            </w:r>
-            <w:r>
-              <w:rPr>
-                <w:rFonts w:ascii="Book Antiqua" w:hAnsi="Book Antiqua"/>
-                <w:sz w:val="18"/>
-                <w:szCs w:val="18"/>
-              </w:rPr>
-              <w:t>Digital 1000 Plus V</w:t>
+              <w:t>Make - Numeric       Model – Digital 1000 Plus V</w:t>
             </w:r>
           </w:p>
         </w:tc>
@@ -2468,6 +2670,13 @@
                 <w:szCs w:val="18"/>
               </w:rPr>
             </w:pPr>
+            <w:r>
+              <w:rPr>
+                <w:rFonts w:ascii="Bookman Old Style" w:hAnsi="Bookman Old Style"/>
+                <w:sz w:val="18"/>
+              </w:rPr>
+              <w:t>01</w:t>
+            </w:r>
           </w:p>
         </w:tc>
         <w:tc>
@@ -2491,6 +2700,13 @@
                 <w:lang w:bidi="ar-SA"/>
               </w:rPr>
             </w:pPr>
+            <w:r>
+              <w:rPr>
+                <w:rFonts w:ascii="Bookman Old Style" w:hAnsi="Bookman Old Style"/>
+                <w:sz w:val="18"/>
+              </w:rPr>
+              <w:t>01</w:t>
+            </w:r>
           </w:p>
         </w:tc>
         <w:tc>
@@ -2512,6 +2728,13 @@
                 <w:szCs w:val="18"/>
               </w:rPr>
             </w:pPr>
+            <w:r>
+              <w:rPr>
+                <w:rFonts w:ascii="Bookman Old Style" w:hAnsi="Bookman Old Style"/>
+                <w:sz w:val="18"/>
+              </w:rPr>
+              <w:t>Yes</w:t>
+            </w:r>
           </w:p>
         </w:tc>
         <w:tc>
@@ -2533,6 +2756,13 @@
                 <w:szCs w:val="18"/>
               </w:rPr>
             </w:pPr>
+            <w:r>
+              <w:rPr>
+                <w:rFonts w:ascii="Bookman Old Style" w:hAnsi="Bookman Old Style"/>
+                <w:sz w:val="18"/>
+              </w:rPr>
+              <w:t>Yes</w:t>
+            </w:r>
           </w:p>
         </w:tc>
       </w:tr>
@@ -2761,14 +2991,7 @@
                 <w:rFonts w:ascii="Bookman Old Style" w:hAnsi="Bookman Old Style"/>
                 <w:sz w:val="18"/>
               </w:rPr>
-              <w:t>6</w:t>
-            </w:r>
-            <w:r>
-              <w:rPr>
-                <w:rFonts w:ascii="Bookman Old Style" w:hAnsi="Bookman Old Style"/>
-                <w:sz w:val="18"/>
-              </w:rPr>
-              <w:t>.</w:t>
+              <w:t>6.</w:t>
             </w:r>
           </w:p>
         </w:tc>
@@ -2838,15 +3061,7 @@
                 <w:sz w:val="18"/>
                 <w:szCs w:val="18"/>
               </w:rPr>
-              <w:t xml:space="preserve">Make- Zebronics        Model- </w:t>
-            </w:r>
-            <w:r>
-              <w:rPr>
-                <w:rFonts w:ascii="Book Antiqua" w:hAnsi="Book Antiqua"/>
-                <w:sz w:val="18"/>
-                <w:szCs w:val="18"/>
-              </w:rPr>
-              <w:t>Zeb1001HMV</w:t>
+              <w:t>Make- Zebronics        Model- Zeb1001HMV</w:t>
             </w:r>
           </w:p>
         </w:tc>
@@ -2874,6 +3089,15 @@
                 <w:szCs w:val="18"/>
               </w:rPr>
             </w:pPr>
+            <w:r>
+              <w:rPr>
+                <w:rFonts w:ascii="Book Antiqua" w:hAnsi="Book Antiqua"/>
+                <w:color w:val="000000" w:themeColor="text1"/>
+                <w:sz w:val="18"/>
+                <w:szCs w:val="18"/>
+              </w:rPr>
+              <w:t>05</w:t>
+            </w:r>
           </w:p>
         </w:tc>
         <w:tc>
@@ -2900,6 +3124,15 @@
                 <w:szCs w:val="18"/>
               </w:rPr>
             </w:pPr>
+            <w:r>
+              <w:rPr>
+                <w:rFonts w:ascii="Book Antiqua" w:hAnsi="Book Antiqua"/>
+                <w:color w:val="000000" w:themeColor="text1"/>
+                <w:sz w:val="18"/>
+                <w:szCs w:val="18"/>
+              </w:rPr>
+              <w:t>05</w:t>
+            </w:r>
           </w:p>
         </w:tc>
         <w:tc>
@@ -2925,6 +3158,14 @@
                 <w:szCs w:val="18"/>
               </w:rPr>
             </w:pPr>
+            <w:r>
+              <w:rPr>
+                <w:rFonts w:ascii="Book Antiqua" w:hAnsi="Book Antiqua"/>
+                <w:sz w:val="18"/>
+                <w:szCs w:val="18"/>
+              </w:rPr>
+              <w:t>Yes</w:t>
+            </w:r>
           </w:p>
         </w:tc>
         <w:tc>
@@ -2950,6 +3191,14 @@
                 <w:szCs w:val="18"/>
               </w:rPr>
             </w:pPr>
+            <w:r>
+              <w:rPr>
+                <w:rFonts w:ascii="Book Antiqua" w:hAnsi="Book Antiqua"/>
+                <w:sz w:val="18"/>
+                <w:szCs w:val="18"/>
+              </w:rPr>
+              <w:t>Yes</w:t>
+            </w:r>
           </w:p>
         </w:tc>
       </w:tr>
@@ -3198,14 +3447,7 @@
                 <w:rFonts w:ascii="Bookman Old Style" w:hAnsi="Bookman Old Style"/>
                 <w:sz w:val="18"/>
               </w:rPr>
-              <w:t>7</w:t>
-            </w:r>
-            <w:r>
-              <w:rPr>
-                <w:rFonts w:ascii="Bookman Old Style" w:hAnsi="Bookman Old Style"/>
-                <w:sz w:val="18"/>
-              </w:rPr>
-              <w:t>.</w:t>
+              <w:t>7.</w:t>
             </w:r>
           </w:p>
         </w:tc>
@@ -3305,6 +3547,20 @@
                 <w:szCs w:val="24"/>
               </w:rPr>
             </w:pPr>
+            <w:r>
+              <w:rPr>
+                <w:rFonts w:ascii="Bookman Old Style" w:hAnsi="Bookman Old Style"/>
+                <w:sz w:val="18"/>
+              </w:rPr>
+              <w:t>0</w:t>
+            </w:r>
+            <w:r>
+              <w:rPr>
+                <w:rFonts w:ascii="Bookman Old Style" w:hAnsi="Bookman Old Style"/>
+                <w:sz w:val="18"/>
+              </w:rPr>
+              <w:t>1</w:t>
+            </w:r>
           </w:p>
         </w:tc>
         <w:tc>
@@ -3332,6 +3588,13 @@
                 <w:lang w:bidi="ar-SA"/>
               </w:rPr>
             </w:pPr>
+            <w:r>
+              <w:rPr>
+                <w:rFonts w:ascii="Bookman Old Style" w:hAnsi="Bookman Old Style"/>
+                <w:sz w:val="18"/>
+              </w:rPr>
+              <w:t>01</w:t>
+            </w:r>
           </w:p>
         </w:tc>
         <w:tc>
@@ -3356,6 +3619,13 @@
                 <w:sz w:val="18"/>
               </w:rPr>
             </w:pPr>
+            <w:r>
+              <w:rPr>
+                <w:rFonts w:ascii="Bookman Old Style" w:hAnsi="Bookman Old Style"/>
+                <w:sz w:val="18"/>
+              </w:rPr>
+              <w:t>Yes</w:t>
+            </w:r>
           </w:p>
         </w:tc>
         <w:tc>
@@ -3380,6 +3650,13 @@
                 <w:sz w:val="18"/>
               </w:rPr>
             </w:pPr>
+            <w:r>
+              <w:rPr>
+                <w:rFonts w:ascii="Bookman Old Style" w:hAnsi="Bookman Old Style"/>
+                <w:sz w:val="18"/>
+              </w:rPr>
+              <w:t>Yes</w:t>
+            </w:r>
           </w:p>
         </w:tc>
       </w:tr>
@@ -3412,14 +3689,7 @@
                 <w:sz w:val="18"/>
               </w:rPr>
               <w:lastRenderedPageBreak/>
-              <w:t>8</w:t>
-            </w:r>
-            <w:r>
-              <w:rPr>
-                <w:rFonts w:ascii="Bookman Old Style" w:hAnsi="Bookman Old Style"/>
-                <w:sz w:val="18"/>
-              </w:rPr>
-              <w:t>.</w:t>
+              <w:t>8.</w:t>
             </w:r>
           </w:p>
         </w:tc>
@@ -3536,6 +3806,24 @@
                 <w:szCs w:val="24"/>
               </w:rPr>
             </w:pPr>
+            <w:r>
+              <w:rPr>
+                <w:rFonts w:ascii="Bookman Old Style" w:hAnsi="Bookman Old Style"/>
+                <w:color w:val="000000" w:themeColor="text1"/>
+                <w:sz w:val="20"/>
+                <w:szCs w:val="24"/>
+              </w:rPr>
+              <w:t>0</w:t>
+            </w:r>
+            <w:r>
+              <w:rPr>
+                <w:rFonts w:ascii="Bookman Old Style" w:hAnsi="Bookman Old Style"/>
+                <w:color w:val="000000" w:themeColor="text1"/>
+                <w:sz w:val="20"/>
+                <w:szCs w:val="24"/>
+              </w:rPr>
+              <w:t>1</w:t>
+            </w:r>
           </w:p>
         </w:tc>
         <w:tc>
@@ -3564,6 +3852,16 @@
                 <w:lang w:bidi="ar-SA"/>
               </w:rPr>
             </w:pPr>
+            <w:r>
+              <w:rPr>
+                <w:rFonts w:ascii="Bookman Old Style" w:hAnsi="Bookman Old Style"/>
+                <w:color w:val="000000" w:themeColor="text1"/>
+                <w:sz w:val="20"/>
+                <w:szCs w:val="24"/>
+                <w:lang w:bidi="ar-SA"/>
+              </w:rPr>
+              <w:t>01</w:t>
+            </w:r>
           </w:p>
         </w:tc>
         <w:tc>
@@ -3589,6 +3887,13 @@
                 <w:sz w:val="18"/>
               </w:rPr>
             </w:pPr>
+            <w:r>
+              <w:rPr>
+                <w:rFonts w:ascii="Bookman Old Style" w:hAnsi="Bookman Old Style"/>
+                <w:sz w:val="18"/>
+              </w:rPr>
+              <w:t>Yes</w:t>
+            </w:r>
           </w:p>
         </w:tc>
         <w:tc>
@@ -3614,6 +3919,13 @@
                 <w:sz w:val="18"/>
               </w:rPr>
             </w:pPr>
+            <w:r>
+              <w:rPr>
+                <w:rFonts w:ascii="Bookman Old Style" w:hAnsi="Bookman Old Style"/>
+                <w:sz w:val="18"/>
+              </w:rPr>
+              <w:t>Yes</w:t>
+            </w:r>
           </w:p>
         </w:tc>
       </w:tr>
@@ -3645,14 +3957,7 @@
                 <w:rFonts w:ascii="Bookman Old Style" w:hAnsi="Bookman Old Style"/>
                 <w:sz w:val="18"/>
               </w:rPr>
-              <w:t>9</w:t>
-            </w:r>
-            <w:r>
-              <w:rPr>
-                <w:rFonts w:ascii="Bookman Old Style" w:hAnsi="Bookman Old Style"/>
-                <w:sz w:val="18"/>
-              </w:rPr>
-              <w:t>.</w:t>
+              <w:t>9.</w:t>
             </w:r>
           </w:p>
         </w:tc>
@@ -3722,15 +4027,7 @@
                 <w:sz w:val="24"/>
                 <w:szCs w:val="28"/>
               </w:rPr>
-              <w:t xml:space="preserve">Installed in </w:t>
-            </w:r>
-            <w:r>
-              <w:rPr>
-                <w:rFonts w:ascii="Bookman Old Style" w:hAnsi="Bookman Old Style"/>
-                <w:sz w:val="24"/>
-                <w:szCs w:val="28"/>
-              </w:rPr>
-              <w:t xml:space="preserve">INCS (01) </w:t>
+              <w:t xml:space="preserve">Installed in INCS (01) </w:t>
             </w:r>
             <w:proofErr w:type="gramStart"/>
             <w:r>
@@ -3777,23 +4074,7 @@
                 <w:sz w:val="24"/>
                 <w:szCs w:val="28"/>
               </w:rPr>
-              <w:t xml:space="preserve">) </w:t>
-            </w:r>
-            <w:r>
-              <w:rPr>
-                <w:rFonts w:ascii="Bookman Old Style" w:hAnsi="Bookman Old Style"/>
-                <w:sz w:val="24"/>
-                <w:szCs w:val="28"/>
-              </w:rPr>
-              <w:t xml:space="preserve"> desktop</w:t>
-            </w:r>
-            <w:r>
-              <w:rPr>
-                <w:rFonts w:ascii="Bookman Old Style" w:hAnsi="Bookman Old Style"/>
-                <w:sz w:val="24"/>
-                <w:szCs w:val="28"/>
-              </w:rPr>
-              <w:t>s</w:t>
+              <w:t>)  desktops</w:t>
             </w:r>
             <w:proofErr w:type="gramEnd"/>
           </w:p>
@@ -3823,6 +4104,15 @@
                 <w:szCs w:val="24"/>
               </w:rPr>
             </w:pPr>
+            <w:r>
+              <w:rPr>
+                <w:rFonts w:ascii="Bookman Old Style" w:hAnsi="Bookman Old Style"/>
+                <w:color w:val="000000" w:themeColor="text1"/>
+                <w:sz w:val="20"/>
+                <w:szCs w:val="24"/>
+              </w:rPr>
+              <w:t>06</w:t>
+            </w:r>
           </w:p>
         </w:tc>
         <w:tc>
@@ -3850,6 +4140,15 @@
                 <w:szCs w:val="24"/>
               </w:rPr>
             </w:pPr>
+            <w:r>
+              <w:rPr>
+                <w:rFonts w:ascii="Bookman Old Style" w:hAnsi="Bookman Old Style"/>
+                <w:color w:val="000000" w:themeColor="text1"/>
+                <w:sz w:val="20"/>
+                <w:szCs w:val="24"/>
+              </w:rPr>
+              <w:t>06</w:t>
+            </w:r>
           </w:p>
         </w:tc>
         <w:tc>
@@ -3875,6 +4174,13 @@
                 <w:sz w:val="18"/>
               </w:rPr>
             </w:pPr>
+            <w:r>
+              <w:rPr>
+                <w:rFonts w:ascii="Bookman Old Style" w:hAnsi="Bookman Old Style"/>
+                <w:sz w:val="18"/>
+              </w:rPr>
+              <w:t>Yes</w:t>
+            </w:r>
           </w:p>
         </w:tc>
         <w:tc>
@@ -3900,6 +4206,13 @@
                 <w:sz w:val="18"/>
               </w:rPr>
             </w:pPr>
+            <w:r>
+              <w:rPr>
+                <w:rFonts w:ascii="Bookman Old Style" w:hAnsi="Bookman Old Style"/>
+                <w:sz w:val="18"/>
+              </w:rPr>
+              <w:t>Yes</w:t>
+            </w:r>
           </w:p>
         </w:tc>
       </w:tr>
@@ -8920,18 +9233,15 @@
 </file>
 
 <file path=customXml/item1.xml><?xml version="1.0" encoding="utf-8"?>
-<p:properties xmlns:p="http://schemas.microsoft.com/office/2006/metadata/properties" xmlns:xsi="http://www.w3.org/2001/XMLSchema-instance" xmlns:pc="http://schemas.microsoft.com/office/infopath/2007/PartnerControls">
-  <documentManagement>
-    <_activity xmlns="45a078ab-2b61-43b1-ba8b-b70fa7077f3e" xsi:nil="true"/>
-  </documentManagement>
-</p:properties>
+<?mso-contentType ?>
+<FormTemplates xmlns="http://schemas.microsoft.com/sharepoint/v3/contenttype/forms">
+  <Display>DocumentLibraryForm</Display>
+  <Edit>DocumentLibraryForm</Edit>
+  <New>DocumentLibraryForm</New>
+</FormTemplates>
 </file>
 
 <file path=customXml/item2.xml><?xml version="1.0" encoding="utf-8"?>
-<b:Sources xmlns:b="http://schemas.openxmlformats.org/officeDocument/2006/bibliography" xmlns="http://schemas.openxmlformats.org/officeDocument/2006/bibliography" SelectedStyle="\APASixthEditionOfficeOnline.xsl" StyleName="APA" Version="6"/>
-</file>
-
-<file path=customXml/item3.xml><?xml version="1.0" encoding="utf-8"?>
 <ct:contentTypeSchema xmlns:ct="http://schemas.microsoft.com/office/2006/metadata/contentType" xmlns:ma="http://schemas.microsoft.com/office/2006/metadata/properties/metaAttributes" ct:_="" ma:_="" ma:contentTypeName="Document" ma:contentTypeID="0x010100FA9B26620BEE7741BFF5E3F11392B230" ma:contentTypeVersion="13" ma:contentTypeDescription="Create a new document." ma:contentTypeScope="" ma:versionID="135a2a34de808c2101250bed7a6a78be">
   <xsd:schema xmlns:xsd="http://www.w3.org/2001/XMLSchema" xmlns:xs="http://www.w3.org/2001/XMLSchema" xmlns:p="http://schemas.microsoft.com/office/2006/metadata/properties" xmlns:ns3="45a078ab-2b61-43b1-ba8b-b70fa7077f3e" targetNamespace="http://schemas.microsoft.com/office/2006/metadata/properties" ma:root="true" ma:fieldsID="9075ab4ac7e9378722fc682dfe4d4edf" ns3:_="">
     <xsd:import namespace="45a078ab-2b61-43b1-ba8b-b70fa7077f3e"/>
@@ -9133,34 +9443,27 @@
 </ct:contentTypeSchema>
 </file>
 
+<file path=customXml/item3.xml><?xml version="1.0" encoding="utf-8"?>
+<b:Sources xmlns:b="http://schemas.openxmlformats.org/officeDocument/2006/bibliography" xmlns="http://schemas.openxmlformats.org/officeDocument/2006/bibliography" SelectedStyle="\APASixthEditionOfficeOnline.xsl" StyleName="APA" Version="6"/>
+</file>
+
 <file path=customXml/item4.xml><?xml version="1.0" encoding="utf-8"?>
-<?mso-contentType ?>
-<FormTemplates xmlns="http://schemas.microsoft.com/sharepoint/v3/contenttype/forms">
-  <Display>DocumentLibraryForm</Display>
-  <Edit>DocumentLibraryForm</Edit>
-  <New>DocumentLibraryForm</New>
-</FormTemplates>
+<p:properties xmlns:p="http://schemas.microsoft.com/office/2006/metadata/properties" xmlns:xsi="http://www.w3.org/2001/XMLSchema-instance" xmlns:pc="http://schemas.microsoft.com/office/infopath/2007/PartnerControls">
+  <documentManagement>
+    <_activity xmlns="45a078ab-2b61-43b1-ba8b-b70fa7077f3e" xsi:nil="true"/>
+  </documentManagement>
+</p:properties>
 </file>
 
 <file path=customXml/itemProps1.xml><?xml version="1.0" encoding="utf-8"?>
-<ds:datastoreItem xmlns:ds="http://schemas.openxmlformats.org/officeDocument/2006/customXml" ds:itemID="{4CD6DF33-1736-4CBB-A6D5-DEA2C54EB479}">
+<ds:datastoreItem xmlns:ds="http://schemas.openxmlformats.org/officeDocument/2006/customXml" ds:itemID="{0E0F6021-A207-44F2-A96B-E3F12C5AAD82}">
   <ds:schemaRefs>
-    <ds:schemaRef ds:uri="http://schemas.microsoft.com/office/2006/metadata/properties"/>
-    <ds:schemaRef ds:uri="http://schemas.microsoft.com/office/infopath/2007/PartnerControls"/>
-    <ds:schemaRef ds:uri="45a078ab-2b61-43b1-ba8b-b70fa7077f3e"/>
+    <ds:schemaRef ds:uri="http://schemas.microsoft.com/sharepoint/v3/contenttype/forms"/>
   </ds:schemaRefs>
 </ds:datastoreItem>
 </file>
 
 <file path=customXml/itemProps2.xml><?xml version="1.0" encoding="utf-8"?>
-<ds:datastoreItem xmlns:ds="http://schemas.openxmlformats.org/officeDocument/2006/customXml" ds:itemID="{DA93BAAA-787A-4B1D-8ACB-D9B8FA587F1B}">
-  <ds:schemaRefs>
-    <ds:schemaRef ds:uri="http://schemas.openxmlformats.org/officeDocument/2006/bibliography"/>
-  </ds:schemaRefs>
-</ds:datastoreItem>
-</file>
-
-<file path=customXml/itemProps3.xml><?xml version="1.0" encoding="utf-8"?>
 <ds:datastoreItem xmlns:ds="http://schemas.openxmlformats.org/officeDocument/2006/customXml" ds:itemID="{A938007B-0869-4958-8BF8-8B697823355B}">
   <ds:schemaRefs>
     <ds:schemaRef ds:uri="http://schemas.microsoft.com/office/2006/metadata/contentType"/>
@@ -9178,10 +9481,20 @@
 </ds:datastoreItem>
 </file>
 
+<file path=customXml/itemProps3.xml><?xml version="1.0" encoding="utf-8"?>
+<ds:datastoreItem xmlns:ds="http://schemas.openxmlformats.org/officeDocument/2006/customXml" ds:itemID="{DA93BAAA-787A-4B1D-8ACB-D9B8FA587F1B}">
+  <ds:schemaRefs>
+    <ds:schemaRef ds:uri="http://schemas.openxmlformats.org/officeDocument/2006/bibliography"/>
+  </ds:schemaRefs>
+</ds:datastoreItem>
+</file>
+
 <file path=customXml/itemProps4.xml><?xml version="1.0" encoding="utf-8"?>
-<ds:datastoreItem xmlns:ds="http://schemas.openxmlformats.org/officeDocument/2006/customXml" ds:itemID="{0E0F6021-A207-44F2-A96B-E3F12C5AAD82}">
+<ds:datastoreItem xmlns:ds="http://schemas.openxmlformats.org/officeDocument/2006/customXml" ds:itemID="{4CD6DF33-1736-4CBB-A6D5-DEA2C54EB479}">
   <ds:schemaRefs>
-    <ds:schemaRef ds:uri="http://schemas.microsoft.com/sharepoint/v3/contenttype/forms"/>
+    <ds:schemaRef ds:uri="http://schemas.microsoft.com/office/2006/metadata/properties"/>
+    <ds:schemaRef ds:uri="http://schemas.microsoft.com/office/infopath/2007/PartnerControls"/>
+    <ds:schemaRef ds:uri="45a078ab-2b61-43b1-ba8b-b70fa7077f3e"/>
   </ds:schemaRefs>
 </ds:datastoreItem>
 </file>
</xml_diff>